<commit_message>
add evaluation and update readme
</commit_message>
<xml_diff>
--- a/homework1/docs/report.docx
+++ b/homework1/docs/report.docx
@@ -470,7 +470,7 @@
         </w:rPr>
         <w:lastRenderedPageBreak/>
         <w:drawing>
-          <wp:anchor distT="0" distB="0" distL="114300" distR="114300" simplePos="0" relativeHeight="251658240" behindDoc="0" locked="0" layoutInCell="1" allowOverlap="1" wp14:anchorId="2302FDD8" wp14:editId="6FC37E5A">
+          <wp:anchor distT="0" distB="0" distL="114300" distR="114300" simplePos="0" relativeHeight="251658240" behindDoc="0" locked="0" layoutInCell="1" allowOverlap="1" wp14:anchorId="2302FDD8" wp14:editId="523521DE">
             <wp:simplePos x="0" y="0"/>
             <wp:positionH relativeFrom="column">
               <wp:posOffset>-826522</wp:posOffset>
@@ -1125,6 +1125,7 @@
       </w:pPr>
       <w:r>
         <w:rPr>
+          <w:noProof/>
           <w:sz w:val="26"/>
           <w:szCs w:val="26"/>
         </w:rPr>
@@ -1384,23 +1385,7 @@
           <w:sz w:val="26"/>
           <w:szCs w:val="26"/>
         </w:rPr>
-        <w:t xml:space="preserve">, and applied normalization to the datasets to scale the features down so the training phase can be more stable. Here, I used Robust Scaler (based on median and IQR) since it’s more robust to outliers </w:t>
-      </w:r>
-      <w:proofErr w:type="spellStart"/>
-      <w:r>
-        <w:rPr>
-          <w:sz w:val="26"/>
-          <w:szCs w:val="26"/>
-        </w:rPr>
-        <w:t>in</w:t>
-      </w:r>
-      <w:proofErr w:type="spellEnd"/>
-      <w:r>
-        <w:rPr>
-          <w:sz w:val="26"/>
-          <w:szCs w:val="26"/>
-        </w:rPr>
-        <w:t xml:space="preserve"> this dataset.</w:t>
+        <w:t>, and applied normalization to the datasets to scale the features down so the training phase can be more stable. Here, I used Robust Scaler (based on median and IQR) since it’s more robust to outliers in this dataset.</w:t>
       </w:r>
     </w:p>
     <w:p>
@@ -1909,6 +1894,21 @@
           <w:szCs w:val="26"/>
         </w:rPr>
         <w:t xml:space="preserve"> activation, and I also applied batch normalization, gradient clipping, and early stopping techniques to help avoid gradient exploding, stable training and better generalization.</w:t>
+      </w:r>
+    </w:p>
+    <w:p>
+      <w:pPr>
+        <w:rPr>
+          <w:sz w:val="26"/>
+          <w:szCs w:val="26"/>
+        </w:rPr>
+      </w:pPr>
+      <w:r>
+        <w:rPr>
+          <w:sz w:val="26"/>
+          <w:szCs w:val="26"/>
+        </w:rPr>
+        <w:t>Additionally, I tried adding other techniques like L2 regularization, dropout, however, with this dataset, they didn’t seem to work, so I disabled them.</w:t>
       </w:r>
     </w:p>
     <w:p>
@@ -2993,6 +2993,7 @@
           <w:sz w:val="26"/>
           <w:szCs w:val="26"/>
         </w:rPr>
+        <w:lastRenderedPageBreak/>
         <w:t xml:space="preserve">* </w:t>
       </w:r>
       <w:r>
@@ -3036,7 +3037,6 @@
           <w:szCs w:val="26"/>
           <w:lang w:val="vi-VN"/>
         </w:rPr>
-        <w:lastRenderedPageBreak/>
         <w:t xml:space="preserve">* I </w:t>
       </w:r>
       <w:r>
@@ -3177,6 +3177,7 @@
         <w:rPr>
           <w:b/>
           <w:bCs/>
+          <w:noProof/>
           <w:sz w:val="26"/>
           <w:szCs w:val="26"/>
         </w:rPr>
@@ -3257,7 +3258,6 @@
     </w:p>
     <w:p>
       <w:pPr>
-        <w:pStyle w:val="ListParagraph"/>
         <w:rPr>
           <w:b/>
           <w:bCs/>
@@ -3267,15 +3267,12 @@
       </w:pPr>
       <w:r>
         <w:rPr>
-          <w:b/>
-          <w:bCs/>
-          <w:sz w:val="26"/>
-          <w:szCs w:val="26"/>
+          <w:noProof/>
         </w:rPr>
         <w:drawing>
-          <wp:inline distT="0" distB="0" distL="0" distR="0" wp14:anchorId="54DA431D" wp14:editId="47B570B7">
-            <wp:extent cx="5420138" cy="3252083"/>
-            <wp:effectExtent l="0" t="0" r="3175" b="0"/>
+          <wp:inline distT="0" distB="0" distL="0" distR="0" wp14:anchorId="54DA431D" wp14:editId="0AF1BD43">
+            <wp:extent cx="5857460" cy="3514476"/>
+            <wp:effectExtent l="0" t="0" r="0" b="3810"/>
             <wp:docPr id="2118219538" name="Picture 1" descr="A graph with blue and orange lines&#10;&#10;AI-generated content may be incorrect."/>
             <wp:cNvGraphicFramePr>
               <a:graphicFrameLocks xmlns:a="http://schemas.openxmlformats.org/drawingml/2006/main" noChangeAspect="1"/>
@@ -3296,7 +3293,7 @@
                   <pic:spPr>
                     <a:xfrm>
                       <a:off x="0" y="0"/>
-                      <a:ext cx="5461873" cy="3277124"/>
+                      <a:ext cx="5933033" cy="3559820"/>
                     </a:xfrm>
                     <a:prstGeom prst="rect">
                       <a:avLst/>
@@ -3344,6 +3341,7 @@
         <w:rPr>
           <w:b/>
           <w:bCs/>
+          <w:noProof/>
           <w:sz w:val="26"/>
           <w:szCs w:val="26"/>
         </w:rPr>
@@ -3435,6 +3433,7 @@
         <w:rPr>
           <w:b/>
           <w:bCs/>
+          <w:noProof/>
           <w:sz w:val="26"/>
           <w:szCs w:val="26"/>
         </w:rPr>
@@ -3510,6 +3509,7 @@
         <w:rPr>
           <w:b/>
           <w:bCs/>
+          <w:noProof/>
           <w:sz w:val="26"/>
           <w:szCs w:val="26"/>
         </w:rPr>
@@ -3586,6 +3586,7 @@
         <w:rPr>
           <w:b/>
           <w:bCs/>
+          <w:noProof/>
           <w:sz w:val="26"/>
           <w:szCs w:val="26"/>
         </w:rPr>
@@ -3661,6 +3662,7 @@
         <w:rPr>
           <w:b/>
           <w:bCs/>
+          <w:noProof/>
           <w:sz w:val="26"/>
           <w:szCs w:val="26"/>
         </w:rPr>
@@ -3714,6 +3716,7 @@
         <w:rPr>
           <w:b/>
           <w:bCs/>
+          <w:noProof/>
           <w:sz w:val="26"/>
           <w:szCs w:val="26"/>
         </w:rPr>
@@ -3754,6 +3757,262 @@
           </wp:inline>
         </w:drawing>
       </w:r>
+    </w:p>
+    <w:p>
+      <w:pPr>
+        <w:rPr>
+          <w:sz w:val="26"/>
+          <w:szCs w:val="26"/>
+        </w:rPr>
+      </w:pPr>
+      <w:r>
+        <w:rPr>
+          <w:b/>
+          <w:bCs/>
+          <w:sz w:val="26"/>
+          <w:szCs w:val="26"/>
+        </w:rPr>
+        <w:lastRenderedPageBreak/>
+        <w:drawing>
+          <wp:anchor distT="0" distB="0" distL="114300" distR="114300" simplePos="0" relativeHeight="251660288" behindDoc="0" locked="0" layoutInCell="1" allowOverlap="1" wp14:anchorId="027CA202" wp14:editId="0A3563CB">
+            <wp:simplePos x="0" y="0"/>
+            <wp:positionH relativeFrom="column">
+              <wp:posOffset>-755374</wp:posOffset>
+            </wp:positionH>
+            <wp:positionV relativeFrom="paragraph">
+              <wp:posOffset>335525</wp:posOffset>
+            </wp:positionV>
+            <wp:extent cx="7476896" cy="5518205"/>
+            <wp:effectExtent l="0" t="0" r="3810" b="0"/>
+            <wp:wrapNone/>
+            <wp:docPr id="1336244514" name="Picture 1" descr="A group of colorful bars&#10;&#10;AI-generated content may be incorrect."/>
+            <wp:cNvGraphicFramePr>
+              <a:graphicFrameLocks xmlns:a="http://schemas.openxmlformats.org/drawingml/2006/main" noChangeAspect="1"/>
+            </wp:cNvGraphicFramePr>
+            <a:graphic xmlns:a="http://schemas.openxmlformats.org/drawingml/2006/main">
+              <a:graphicData uri="http://schemas.openxmlformats.org/drawingml/2006/picture">
+                <pic:pic xmlns:pic="http://schemas.openxmlformats.org/drawingml/2006/picture">
+                  <pic:nvPicPr>
+                    <pic:cNvPr id="1336244514" name="Picture 1" descr="A group of colorful bars&#10;&#10;AI-generated content may be incorrect."/>
+                    <pic:cNvPicPr/>
+                  </pic:nvPicPr>
+                  <pic:blipFill>
+                    <a:blip r:embed="rId18">
+                      <a:extLst>
+                        <a:ext uri="{28A0092B-C50C-407E-A947-70E740481C1C}">
+                          <a14:useLocalDpi xmlns:a14="http://schemas.microsoft.com/office/drawing/2010/main" val="0"/>
+                        </a:ext>
+                      </a:extLst>
+                    </a:blip>
+                    <a:stretch>
+                      <a:fillRect/>
+                    </a:stretch>
+                  </pic:blipFill>
+                  <pic:spPr>
+                    <a:xfrm>
+                      <a:off x="0" y="0"/>
+                      <a:ext cx="7476896" cy="5518205"/>
+                    </a:xfrm>
+                    <a:prstGeom prst="rect">
+                      <a:avLst/>
+                    </a:prstGeom>
+                  </pic:spPr>
+                </pic:pic>
+              </a:graphicData>
+            </a:graphic>
+            <wp14:sizeRelH relativeFrom="page">
+              <wp14:pctWidth>0</wp14:pctWidth>
+            </wp14:sizeRelH>
+            <wp14:sizeRelV relativeFrom="page">
+              <wp14:pctHeight>0</wp14:pctHeight>
+            </wp14:sizeRelV>
+          </wp:anchor>
+        </w:drawing>
+      </w:r>
+      <w:r>
+        <w:rPr>
+          <w:sz w:val="26"/>
+          <w:szCs w:val="26"/>
+        </w:rPr>
+        <w:t>Below plot helps visualize the performance for comparison:</w:t>
+      </w:r>
+    </w:p>
+    <w:p>
+      <w:pPr>
+        <w:rPr>
+          <w:sz w:val="26"/>
+          <w:szCs w:val="26"/>
+        </w:rPr>
+      </w:pPr>
+    </w:p>
+    <w:p>
+      <w:pPr>
+        <w:rPr>
+          <w:sz w:val="26"/>
+          <w:szCs w:val="26"/>
+        </w:rPr>
+      </w:pPr>
+    </w:p>
+    <w:p>
+      <w:pPr>
+        <w:rPr>
+          <w:sz w:val="26"/>
+          <w:szCs w:val="26"/>
+        </w:rPr>
+      </w:pPr>
+    </w:p>
+    <w:p>
+      <w:pPr>
+        <w:rPr>
+          <w:sz w:val="26"/>
+          <w:szCs w:val="26"/>
+        </w:rPr>
+      </w:pPr>
+    </w:p>
+    <w:p>
+      <w:pPr>
+        <w:rPr>
+          <w:sz w:val="26"/>
+          <w:szCs w:val="26"/>
+        </w:rPr>
+      </w:pPr>
+    </w:p>
+    <w:p>
+      <w:pPr>
+        <w:rPr>
+          <w:sz w:val="26"/>
+          <w:szCs w:val="26"/>
+        </w:rPr>
+      </w:pPr>
+    </w:p>
+    <w:p>
+      <w:pPr>
+        <w:rPr>
+          <w:sz w:val="26"/>
+          <w:szCs w:val="26"/>
+        </w:rPr>
+      </w:pPr>
+    </w:p>
+    <w:p>
+      <w:pPr>
+        <w:rPr>
+          <w:sz w:val="26"/>
+          <w:szCs w:val="26"/>
+        </w:rPr>
+      </w:pPr>
+    </w:p>
+    <w:p>
+      <w:pPr>
+        <w:rPr>
+          <w:sz w:val="26"/>
+          <w:szCs w:val="26"/>
+        </w:rPr>
+      </w:pPr>
+    </w:p>
+    <w:p>
+      <w:pPr>
+        <w:rPr>
+          <w:sz w:val="26"/>
+          <w:szCs w:val="26"/>
+        </w:rPr>
+      </w:pPr>
+    </w:p>
+    <w:p>
+      <w:pPr>
+        <w:rPr>
+          <w:sz w:val="26"/>
+          <w:szCs w:val="26"/>
+        </w:rPr>
+      </w:pPr>
+    </w:p>
+    <w:p>
+      <w:pPr>
+        <w:rPr>
+          <w:sz w:val="26"/>
+          <w:szCs w:val="26"/>
+        </w:rPr>
+      </w:pPr>
+    </w:p>
+    <w:p>
+      <w:pPr>
+        <w:rPr>
+          <w:sz w:val="26"/>
+          <w:szCs w:val="26"/>
+        </w:rPr>
+      </w:pPr>
+    </w:p>
+    <w:p>
+      <w:pPr>
+        <w:rPr>
+          <w:sz w:val="26"/>
+          <w:szCs w:val="26"/>
+        </w:rPr>
+      </w:pPr>
+    </w:p>
+    <w:p>
+      <w:pPr>
+        <w:rPr>
+          <w:sz w:val="26"/>
+          <w:szCs w:val="26"/>
+        </w:rPr>
+      </w:pPr>
+    </w:p>
+    <w:p>
+      <w:pPr>
+        <w:rPr>
+          <w:sz w:val="26"/>
+          <w:szCs w:val="26"/>
+        </w:rPr>
+      </w:pPr>
+    </w:p>
+    <w:p>
+      <w:pPr>
+        <w:rPr>
+          <w:sz w:val="26"/>
+          <w:szCs w:val="26"/>
+        </w:rPr>
+      </w:pPr>
+    </w:p>
+    <w:p>
+      <w:pPr>
+        <w:rPr>
+          <w:sz w:val="26"/>
+          <w:szCs w:val="26"/>
+        </w:rPr>
+      </w:pPr>
+      <w:r>
+        <w:rPr>
+          <w:sz w:val="26"/>
+          <w:szCs w:val="26"/>
+        </w:rPr>
+        <w:t xml:space="preserve">It’s noticeable that increasing model’s capacity for this dataset decreases the performance a lot. The 2 customized model I added </w:t>
+      </w:r>
+      <w:proofErr w:type="gramStart"/>
+      <w:r>
+        <w:rPr>
+          <w:sz w:val="26"/>
+          <w:szCs w:val="26"/>
+        </w:rPr>
+        <w:t>actually performed</w:t>
+      </w:r>
+      <w:proofErr w:type="gramEnd"/>
+      <w:r>
+        <w:rPr>
+          <w:sz w:val="26"/>
+          <w:szCs w:val="26"/>
+        </w:rPr>
+        <w:t xml:space="preserve"> worse than linear regression.</w:t>
+      </w:r>
+    </w:p>
+    <w:p>
+      <w:pPr>
+        <w:rPr>
+          <w:b/>
+          <w:bCs/>
+          <w:sz w:val="26"/>
+          <w:szCs w:val="26"/>
+        </w:rPr>
+      </w:pPr>
     </w:p>
     <w:sectPr>
       <w:pgSz w:w="12240" w:h="15840"/>

</xml_diff>